<commit_message>
E-Business: phan tich xu huong ra de + giai chi tiet de thi that HK2/2024-2025
- Them TL3: phan tich 5 quy luat ra de tu de that, giai chi tiet ca 4 cau
  (IaaS/PaaS/SaaS, cay quyet dinh phat hien gian lan, SMART, SDLC) voi do dai
  dung bang thoi luong thi, kem ma tran rui ro da hieu chinh
- Bo sung C1: bang so sanh IaaS/PaaS/SaaS 9 tieu chi + mo hinh trach nhiem
  phan chia + bang vi du thuc te (truoc day chi co 3 dong liet ke)
- Bo sung C5: chuyen de phat hien gian lan bang cay quyet dinh - y nghia tung
  dac trung, ly do khong dung User ID, 5 nhom dac trung mo rong
- Viet lai TL2b: 3 de mau dung format de that thay cho du doan cu bi lech
  trong tam, kem huong dan phan bo thoi gian theo trong so diem
- Cap nhat muc luc va README

Co-Authored-By: Claude Opus 5 (1M context) <noreply@anthropic.com>
</commit_message>
<xml_diff>
--- a/e-business/TL1-C1-Tong-quan-E-business.docx
+++ b/e-business/TL1-C1-Tong-quan-E-business.docx
@@ -2,7 +2,7 @@
 <file path=word/document.xml><?xml version="1.0" encoding="utf-8"?>
 <w:document xmlns:w="http://schemas.openxmlformats.org/wordprocessingml/2006/main" xmlns:m="http://schemas.openxmlformats.org/officeDocument/2006/math" xmlns:r="http://schemas.openxmlformats.org/officeDocument/2006/relationships" xmlns:o="urn:schemas-microsoft-com:office:office" xmlns:v="urn:schemas-microsoft-com:vml" xmlns:w10="urn:schemas-microsoft-com:office:word" xmlns:a="http://schemas.openxmlformats.org/drawingml/2006/main" xmlns:pic="http://schemas.openxmlformats.org/drawingml/2006/picture" xmlns:wp="http://schemas.openxmlformats.org/drawingml/2006/wordprocessingDrawing">
   <w:body>
-    <w:bookmarkStart w:id="58" w:name="chương-1-tổng-quan-về-e-business"/>
+    <w:bookmarkStart w:id="62" w:name="chương-1-tổng-quan-về-e-business"/>
     <w:p>
       <w:pPr>
         <w:pStyle w:val="Heading1"/>
@@ -3021,7 +3021,7 @@
     </w:p>
     <w:bookmarkEnd w:id="40"/>
     <w:bookmarkEnd w:id="41"/>
-    <w:bookmarkStart w:id="56" w:name="X991f0657cc6d482ac3586c37fc730c91feeb64a"/>
+    <w:bookmarkStart w:id="60" w:name="X991f0657cc6d482ac3586c37fc730c91feeb64a"/>
     <w:p>
       <w:pPr>
         <w:pStyle w:val="Heading2"/>
@@ -4471,13 +4471,84 @@
       </w:r>
     </w:p>
     <w:bookmarkEnd w:id="49"/>
-    <w:bookmarkStart w:id="50" w:name="điện-toán-đám-mây-cloud-computing"/>
+    <w:bookmarkStart w:id="54" w:name="điện-toán-đám-mây-cloud-computing"/>
     <w:p>
       <w:pPr>
         <w:pStyle w:val="Heading3"/>
       </w:pPr>
       <w:r>
-        <w:t xml:space="preserve">2.6. Điện toán đám mây (Cloud Computing)</w:t>
+        <w:t xml:space="preserve">2.6. Điện toán đám mây (Cloud Computing) ⭐⭐⭐</w:t>
+      </w:r>
+    </w:p>
+    <w:p>
+      <w:pPr>
+        <w:pStyle w:val="BlockText"/>
+      </w:pPr>
+      <w:r>
+        <w:t xml:space="preserve">⚠️</w:t>
+      </w:r>
+      <w:r>
+        <w:t xml:space="preserve"> </w:t>
+      </w:r>
+      <w:r>
+        <w:rPr>
+          <w:b/>
+          <w:bCs/>
+        </w:rPr>
+        <w:t xml:space="preserve">CHỦ ĐỀ ĐÃ RA TRONG ĐỀ THI THẬT HK2/2024–2025 (Câu 1 — 2 điểm).</w:t>
+      </w:r>
+      <w:r>
+        <w:t xml:space="preserve"> </w:t>
+      </w:r>
+      <w:r>
+        <w:t xml:space="preserve">Xem bài giải mẫu đầy đủ tại</w:t>
+      </w:r>
+      <w:r>
+        <w:t xml:space="preserve"> </w:t>
+      </w:r>
+      <w:r>
+        <w:rPr>
+          <w:b/>
+          <w:bCs/>
+        </w:rPr>
+        <w:t xml:space="preserve">TL3 – Câu 1</w:t>
+      </w:r>
+      <w:r>
+        <w:t xml:space="preserve">.</w:t>
+      </w:r>
+    </w:p>
+    <w:p>
+      <w:pPr>
+        <w:pStyle w:val="FirstParagraph"/>
+      </w:pPr>
+      <w:r>
+        <w:rPr>
+          <w:b/>
+          <w:bCs/>
+        </w:rPr>
+        <w:t xml:space="preserve">Khái niệm:</w:t>
+      </w:r>
+      <w:r>
+        <w:t xml:space="preserve"> </w:t>
+      </w:r>
+      <w:r>
+        <w:t xml:space="preserve">Doanh nghiệp và cá nhân</w:t>
+      </w:r>
+      <w:r>
+        <w:t xml:space="preserve"> </w:t>
+      </w:r>
+      <w:r>
+        <w:rPr>
+          <w:b/>
+          <w:bCs/>
+        </w:rPr>
+        <w:t xml:space="preserve">thuê năng lực tính toán và phần mềm qua Internet</w:t>
+      </w:r>
+      <w:r>
+        <w:t xml:space="preserve"> </w:t>
+      </w:r>
+      <w:r>
+        <w:t xml:space="preserve">thay vì tự đầu tư hạ tầng.</w:t>
       </w:r>
     </w:p>
     <w:p>
@@ -4489,20 +4560,59 @@
         </w:numPr>
       </w:pPr>
       <w:r>
-        <w:t xml:space="preserve">Doanh nghiệp và cá nhân</w:t>
-      </w:r>
-      <w:r>
-        <w:t xml:space="preserve"> </w:t>
-      </w:r>
-      <w:r>
-        <w:rPr>
-          <w:b/>
-          <w:bCs/>
-        </w:rPr>
-        <w:t xml:space="preserve">thuê năng lực tính toán và phần mềm qua Internet</w:t>
-      </w:r>
-      <w:r>
-        <w:t xml:space="preserve">.</w:t>
+        <w:rPr>
+          <w:b/>
+          <w:bCs/>
+        </w:rPr>
+        <w:t xml:space="preserve">Ba loại dịch vụ:</w:t>
+      </w:r>
+      <w:r>
+        <w:t xml:space="preserve"> </w:t>
+      </w:r>
+      <w:r>
+        <w:rPr>
+          <w:b/>
+          <w:bCs/>
+        </w:rPr>
+        <w:t xml:space="preserve">IaaS</w:t>
+      </w:r>
+      <w:r>
+        <w:t xml:space="preserve"> </w:t>
+      </w:r>
+      <w:r>
+        <w:t xml:space="preserve">(hạ tầng),</w:t>
+      </w:r>
+      <w:r>
+        <w:t xml:space="preserve"> </w:t>
+      </w:r>
+      <w:r>
+        <w:rPr>
+          <w:b/>
+          <w:bCs/>
+        </w:rPr>
+        <w:t xml:space="preserve">PaaS</w:t>
+      </w:r>
+      <w:r>
+        <w:t xml:space="preserve"> </w:t>
+      </w:r>
+      <w:r>
+        <w:t xml:space="preserve">(nền tảng),</w:t>
+      </w:r>
+      <w:r>
+        <w:t xml:space="preserve"> </w:t>
+      </w:r>
+      <w:r>
+        <w:rPr>
+          <w:b/>
+          <w:bCs/>
+        </w:rPr>
+        <w:t xml:space="preserve">SaaS</w:t>
+      </w:r>
+      <w:r>
+        <w:t xml:space="preserve"> </w:t>
+      </w:r>
+      <w:r>
+        <w:t xml:space="preserve">(phần mềm).</w:t>
       </w:r>
     </w:p>
     <w:p>
@@ -4518,55 +4628,55 @@
           <w:b/>
           <w:bCs/>
         </w:rPr>
-        <w:t xml:space="preserve">Ba loại dịch vụ:</w:t>
-      </w:r>
-      <w:r>
-        <w:t xml:space="preserve"> </w:t>
-      </w:r>
-      <w:r>
-        <w:rPr>
-          <w:b/>
-          <w:bCs/>
-        </w:rPr>
-        <w:t xml:space="preserve">IaaS</w:t>
-      </w:r>
-      <w:r>
-        <w:t xml:space="preserve"> </w:t>
-      </w:r>
-      <w:r>
-        <w:t xml:space="preserve">(hạ tầng),</w:t>
-      </w:r>
-      <w:r>
-        <w:t xml:space="preserve"> </w:t>
-      </w:r>
-      <w:r>
-        <w:rPr>
-          <w:b/>
-          <w:bCs/>
-        </w:rPr>
-        <w:t xml:space="preserve">SaaS</w:t>
-      </w:r>
-      <w:r>
-        <w:t xml:space="preserve"> </w:t>
-      </w:r>
-      <w:r>
-        <w:t xml:space="preserve">(phần mềm),</w:t>
-      </w:r>
-      <w:r>
-        <w:t xml:space="preserve"> </w:t>
-      </w:r>
-      <w:r>
-        <w:rPr>
-          <w:b/>
-          <w:bCs/>
-        </w:rPr>
-        <w:t xml:space="preserve">PaaS</w:t>
-      </w:r>
-      <w:r>
-        <w:t xml:space="preserve"> </w:t>
-      </w:r>
-      <w:r>
-        <w:t xml:space="preserve">(nền tảng).</w:t>
+        <w:t xml:space="preserve">Ba mô hình triển khai:</w:t>
+      </w:r>
+      <w:r>
+        <w:t xml:space="preserve"> </w:t>
+      </w:r>
+      <w:r>
+        <w:rPr>
+          <w:b/>
+          <w:bCs/>
+        </w:rPr>
+        <w:t xml:space="preserve">public</w:t>
+      </w:r>
+      <w:r>
+        <w:t xml:space="preserve"> </w:t>
+      </w:r>
+      <w:r>
+        <w:t xml:space="preserve">(dùng chung, rẻ nhất),</w:t>
+      </w:r>
+      <w:r>
+        <w:t xml:space="preserve"> </w:t>
+      </w:r>
+      <w:r>
+        <w:rPr>
+          <w:b/>
+          <w:bCs/>
+        </w:rPr>
+        <w:t xml:space="preserve">private</w:t>
+      </w:r>
+      <w:r>
+        <w:t xml:space="preserve"> </w:t>
+      </w:r>
+      <w:r>
+        <w:t xml:space="preserve">(riêng, kiểm soát cao — phù hợp ngân hàng, y tế),</w:t>
+      </w:r>
+      <w:r>
+        <w:t xml:space="preserve"> </w:t>
+      </w:r>
+      <w:r>
+        <w:rPr>
+          <w:b/>
+          <w:bCs/>
+        </w:rPr>
+        <w:t xml:space="preserve">hybrid</w:t>
+      </w:r>
+      <w:r>
+        <w:t xml:space="preserve"> </w:t>
+      </w:r>
+      <w:r>
+        <w:t xml:space="preserve">(kết hợp — dữ liệu nhạy cảm để private, tải cao điểm đẩy sang public).</w:t>
       </w:r>
     </w:p>
     <w:p>
@@ -4582,13 +4692,23 @@
           <w:b/>
           <w:bCs/>
         </w:rPr>
-        <w:t xml:space="preserve">Ba mô hình triển khai:</w:t>
-      </w:r>
-      <w:r>
-        <w:t xml:space="preserve"> </w:t>
-      </w:r>
-      <w:r>
-        <w:t xml:space="preserve">public, private, hybrid cloud.</w:t>
+        <w:t xml:space="preserve">Ưu điểm:</w:t>
+      </w:r>
+      <w:r>
+        <w:t xml:space="preserve"> </w:t>
+      </w:r>
+      <w:r>
+        <w:rPr>
+          <w:b/>
+          <w:bCs/>
+        </w:rPr>
+        <w:t xml:space="preserve">giảm mạnh chi phí</w:t>
+      </w:r>
+      <w:r>
+        <w:t xml:space="preserve"> </w:t>
+      </w:r>
+      <w:r>
+        <w:t xml:space="preserve">xây dựng và vận hành website, hạ tầng, hỗ trợ CNTT, phần cứng, phần mềm.</w:t>
       </w:r>
     </w:p>
     <w:p>
@@ -4610,33 +4730,1715 @@
         <w:t xml:space="preserve"> </w:t>
       </w:r>
       <w:r>
-        <w:t xml:space="preserve">rủi ro bảo mật; chuyển trách nhiệm lưu trữ và kiểm soát sang nhà cung cấp.</w:t>
-      </w:r>
-    </w:p>
-    <w:p>
-      <w:pPr>
-        <w:pStyle w:val="Compact"/>
-        <w:numPr>
-          <w:ilvl w:val="0"/>
-          <w:numId w:val="1008"/>
-        </w:numPr>
-      </w:pPr>
-      <w:r>
-        <w:rPr>
-          <w:b/>
-          <w:bCs/>
-        </w:rPr>
-        <w:t xml:space="preserve">Ưu điểm:</w:t>
-      </w:r>
-      <w:r>
-        <w:t xml:space="preserve"> </w:t>
-      </w:r>
-      <w:r>
-        <w:t xml:space="preserve">giảm mạnh chi phí xây dựng &amp; vận hành website, hạ tầng, hỗ trợ CNTT, phần cứng, phần mềm.</w:t>
+        <w:rPr>
+          <w:b/>
+          <w:bCs/>
+        </w:rPr>
+        <w:t xml:space="preserve">rủi ro bảo mật</w:t>
+      </w:r>
+      <w:r>
+        <w:t xml:space="preserve">;</w:t>
+      </w:r>
+      <w:r>
+        <w:t xml:space="preserve"> </w:t>
+      </w:r>
+      <w:r>
+        <w:rPr>
+          <w:b/>
+          <w:bCs/>
+        </w:rPr>
+        <w:t xml:space="preserve">chuyển trách nhiệm lưu trữ và kiểm soát dữ liệu sang nhà cung cấp</w:t>
+      </w:r>
+      <w:r>
+        <w:t xml:space="preserve">.</w:t>
+      </w:r>
+    </w:p>
+    <w:bookmarkStart w:id="50" w:name="a-bảng-phân-biệt-iaas-paas-saas"/>
+    <w:p>
+      <w:pPr>
+        <w:pStyle w:val="Heading4"/>
+      </w:pPr>
+      <w:r>
+        <w:t xml:space="preserve">a) Bảng phân biệt IaaS – PaaS – SaaS ⭐⭐⭐</w:t>
+      </w:r>
+    </w:p>
+    <w:tbl>
+      <w:tblPr>
+        <w:tblStyle w:val="Table"/>
+        <w:tblW w:type="pct" w:w="5000"/>
+        <w:tblLayout w:type="fixed"/>
+        <w:tblLook w:firstRow="1" w:lastRow="0" w:firstColumn="0" w:lastColumn="0" w:noHBand="0" w:noVBand="0" w:val="0020"/>
+      </w:tblPr>
+      <w:tblGrid>
+        <w:gridCol w:w="1980"/>
+        <w:gridCol w:w="1980"/>
+        <w:gridCol w:w="1980"/>
+        <w:gridCol w:w="1980"/>
+      </w:tblGrid>
+      <w:tr>
+        <w:trPr>
+          <w:tblHeader w:val="on"/>
+        </w:trPr>
+        <w:tc>
+          <w:tcPr/>
+          <w:p>
+            <w:pPr>
+              <w:pStyle w:val="Compact"/>
+            </w:pPr>
+            <w:r>
+              <w:t xml:space="preserve">Tiêu chí</w:t>
+            </w:r>
+          </w:p>
+        </w:tc>
+        <w:tc>
+          <w:tcPr/>
+          <w:p>
+            <w:pPr>
+              <w:pStyle w:val="Compact"/>
+            </w:pPr>
+            <w:r>
+              <w:rPr>
+                <w:b/>
+                <w:bCs/>
+              </w:rPr>
+              <w:t xml:space="preserve">IaaS</w:t>
+            </w:r>
+            <w:r>
+              <w:t xml:space="preserve">Infrastructure as a Service</w:t>
+            </w:r>
+          </w:p>
+        </w:tc>
+        <w:tc>
+          <w:tcPr/>
+          <w:p>
+            <w:pPr>
+              <w:pStyle w:val="Compact"/>
+            </w:pPr>
+            <w:r>
+              <w:rPr>
+                <w:b/>
+                <w:bCs/>
+              </w:rPr>
+              <w:t xml:space="preserve">PaaS</w:t>
+            </w:r>
+            <w:r>
+              <w:t xml:space="preserve">Platform as a Service</w:t>
+            </w:r>
+          </w:p>
+        </w:tc>
+        <w:tc>
+          <w:tcPr/>
+          <w:p>
+            <w:pPr>
+              <w:pStyle w:val="Compact"/>
+            </w:pPr>
+            <w:r>
+              <w:rPr>
+                <w:b/>
+                <w:bCs/>
+              </w:rPr>
+              <w:t xml:space="preserve">SaaS</w:t>
+            </w:r>
+            <w:r>
+              <w:t xml:space="preserve">Software as a Service</w:t>
+            </w:r>
+          </w:p>
+        </w:tc>
+      </w:tr>
+      <w:tr>
+        <w:tc>
+          <w:tcPr/>
+          <w:p>
+            <w:pPr>
+              <w:pStyle w:val="Compact"/>
+            </w:pPr>
+            <w:r>
+              <w:rPr>
+                <w:b/>
+                <w:bCs/>
+              </w:rPr>
+              <w:t xml:space="preserve">Nhà cung cấp cung cấp</w:t>
+            </w:r>
+          </w:p>
+        </w:tc>
+        <w:tc>
+          <w:tcPr/>
+          <w:p>
+            <w:pPr>
+              <w:pStyle w:val="Compact"/>
+            </w:pPr>
+            <w:r>
+              <w:t xml:space="preserve">Hạ tầng ảo hóa: máy chủ ảo, lưu trữ, mạng, tường lửa</w:t>
+            </w:r>
+          </w:p>
+        </w:tc>
+        <w:tc>
+          <w:tcPr/>
+          <w:p>
+            <w:pPr>
+              <w:pStyle w:val="Compact"/>
+            </w:pPr>
+            <w:r>
+              <w:t xml:space="preserve">Hạ tầng</w:t>
+            </w:r>
+            <w:r>
+              <w:t xml:space="preserve"> </w:t>
+            </w:r>
+            <w:r>
+              <w:rPr>
+                <w:b/>
+                <w:bCs/>
+              </w:rPr>
+              <w:t xml:space="preserve">+ hệ điều hành, runtime, middleware, CSDL, công cụ triển khai</w:t>
+            </w:r>
+          </w:p>
+        </w:tc>
+        <w:tc>
+          <w:tcPr/>
+          <w:p>
+            <w:pPr>
+              <w:pStyle w:val="Compact"/>
+            </w:pPr>
+            <w:r>
+              <w:rPr>
+                <w:b/>
+                <w:bCs/>
+              </w:rPr>
+              <w:t xml:space="preserve">Toàn bộ ứng dụng hoàn chỉnh</w:t>
+            </w:r>
+            <w:r>
+              <w:t xml:space="preserve"> </w:t>
+            </w:r>
+            <w:r>
+              <w:t xml:space="preserve">chạy sẵn</w:t>
+            </w:r>
+          </w:p>
+        </w:tc>
+      </w:tr>
+      <w:tr>
+        <w:tc>
+          <w:tcPr/>
+          <w:p>
+            <w:pPr>
+              <w:pStyle w:val="Compact"/>
+            </w:pPr>
+            <w:r>
+              <w:rPr>
+                <w:b/>
+                <w:bCs/>
+              </w:rPr>
+              <w:t xml:space="preserve">Khách hàng tự quản lý</w:t>
+            </w:r>
+          </w:p>
+        </w:tc>
+        <w:tc>
+          <w:tcPr/>
+          <w:p>
+            <w:pPr>
+              <w:pStyle w:val="Compact"/>
+            </w:pPr>
+            <w:r>
+              <w:t xml:space="preserve">Hệ điều hành, middleware, runtime, ứng dụng, dữ liệu</w:t>
+            </w:r>
+          </w:p>
+        </w:tc>
+        <w:tc>
+          <w:tcPr/>
+          <w:p>
+            <w:pPr>
+              <w:pStyle w:val="Compact"/>
+            </w:pPr>
+            <w:r>
+              <w:rPr>
+                <w:b/>
+                <w:bCs/>
+              </w:rPr>
+              <w:t xml:space="preserve">Chỉ ứng dụng và dữ liệu</w:t>
+            </w:r>
+          </w:p>
+        </w:tc>
+        <w:tc>
+          <w:tcPr/>
+          <w:p>
+            <w:pPr>
+              <w:pStyle w:val="Compact"/>
+            </w:pPr>
+            <w:r>
+              <w:rPr>
+                <w:b/>
+                <w:bCs/>
+              </w:rPr>
+              <w:t xml:space="preserve">Chỉ dữ liệu và cấu hình người dùng</w:t>
+            </w:r>
+          </w:p>
+        </w:tc>
+      </w:tr>
+      <w:tr>
+        <w:tc>
+          <w:tcPr/>
+          <w:p>
+            <w:pPr>
+              <w:pStyle w:val="Compact"/>
+            </w:pPr>
+            <w:r>
+              <w:rPr>
+                <w:b/>
+                <w:bCs/>
+              </w:rPr>
+              <w:t xml:space="preserve">Đối tượng sử dụng chính</w:t>
+            </w:r>
+          </w:p>
+        </w:tc>
+        <w:tc>
+          <w:tcPr/>
+          <w:p>
+            <w:pPr>
+              <w:pStyle w:val="Compact"/>
+            </w:pPr>
+            <w:r>
+              <w:t xml:space="preserve">Quản trị hệ thống, kỹ sư hạ tầng</w:t>
+            </w:r>
+          </w:p>
+        </w:tc>
+        <w:tc>
+          <w:tcPr/>
+          <w:p>
+            <w:pPr>
+              <w:pStyle w:val="Compact"/>
+            </w:pPr>
+            <w:r>
+              <w:rPr>
+                <w:b/>
+                <w:bCs/>
+              </w:rPr>
+              <w:t xml:space="preserve">Lập trình viên</w:t>
+            </w:r>
+          </w:p>
+        </w:tc>
+        <w:tc>
+          <w:tcPr/>
+          <w:p>
+            <w:pPr>
+              <w:pStyle w:val="Compact"/>
+            </w:pPr>
+            <w:r>
+              <w:rPr>
+                <w:b/>
+                <w:bCs/>
+              </w:rPr>
+              <w:t xml:space="preserve">Người dùng cuối / nhân viên nghiệp vụ</w:t>
+            </w:r>
+          </w:p>
+        </w:tc>
+      </w:tr>
+      <w:tr>
+        <w:tc>
+          <w:tcPr/>
+          <w:p>
+            <w:pPr>
+              <w:pStyle w:val="Compact"/>
+            </w:pPr>
+            <w:r>
+              <w:rPr>
+                <w:b/>
+                <w:bCs/>
+              </w:rPr>
+              <w:t xml:space="preserve">Mức kiểm soát</w:t>
+            </w:r>
+          </w:p>
+        </w:tc>
+        <w:tc>
+          <w:tcPr/>
+          <w:p>
+            <w:pPr>
+              <w:pStyle w:val="Compact"/>
+            </w:pPr>
+            <w:r>
+              <w:rPr>
+                <w:b/>
+                <w:bCs/>
+              </w:rPr>
+              <w:t xml:space="preserve">Cao nhất</w:t>
+            </w:r>
+          </w:p>
+        </w:tc>
+        <w:tc>
+          <w:tcPr/>
+          <w:p>
+            <w:pPr>
+              <w:pStyle w:val="Compact"/>
+            </w:pPr>
+            <w:r>
+              <w:t xml:space="preserve">Trung bình</w:t>
+            </w:r>
+          </w:p>
+        </w:tc>
+        <w:tc>
+          <w:tcPr/>
+          <w:p>
+            <w:pPr>
+              <w:pStyle w:val="Compact"/>
+            </w:pPr>
+            <w:r>
+              <w:rPr>
+                <w:b/>
+                <w:bCs/>
+              </w:rPr>
+              <w:t xml:space="preserve">Thấp nhất</w:t>
+            </w:r>
+          </w:p>
+        </w:tc>
+      </w:tr>
+      <w:tr>
+        <w:tc>
+          <w:tcPr/>
+          <w:p>
+            <w:pPr>
+              <w:pStyle w:val="Compact"/>
+            </w:pPr>
+            <w:r>
+              <w:rPr>
+                <w:b/>
+                <w:bCs/>
+              </w:rPr>
+              <w:t xml:space="preserve">Mức tùy biến</w:t>
+            </w:r>
+          </w:p>
+        </w:tc>
+        <w:tc>
+          <w:tcPr/>
+          <w:p>
+            <w:pPr>
+              <w:pStyle w:val="Compact"/>
+            </w:pPr>
+            <w:r>
+              <w:t xml:space="preserve">Rất cao</w:t>
+            </w:r>
+          </w:p>
+        </w:tc>
+        <w:tc>
+          <w:tcPr/>
+          <w:p>
+            <w:pPr>
+              <w:pStyle w:val="Compact"/>
+            </w:pPr>
+            <w:r>
+              <w:t xml:space="preserve">Trung bình (bị ràng buộc bởi nền tảng)</w:t>
+            </w:r>
+          </w:p>
+        </w:tc>
+        <w:tc>
+          <w:tcPr/>
+          <w:p>
+            <w:pPr>
+              <w:pStyle w:val="Compact"/>
+            </w:pPr>
+            <w:r>
+              <w:t xml:space="preserve">Thấp (chỉ cấu hình theo tham số cho sẵn)</w:t>
+            </w:r>
+          </w:p>
+        </w:tc>
+      </w:tr>
+      <w:tr>
+        <w:tc>
+          <w:tcPr/>
+          <w:p>
+            <w:pPr>
+              <w:pStyle w:val="Compact"/>
+            </w:pPr>
+            <w:r>
+              <w:rPr>
+                <w:b/>
+                <w:bCs/>
+              </w:rPr>
+              <w:t xml:space="preserve">Tốc độ triển khai</w:t>
+            </w:r>
+          </w:p>
+        </w:tc>
+        <w:tc>
+          <w:tcPr/>
+          <w:p>
+            <w:pPr>
+              <w:pStyle w:val="Compact"/>
+            </w:pPr>
+            <w:r>
+              <w:t xml:space="preserve">Chậm nhất</w:t>
+            </w:r>
+          </w:p>
+        </w:tc>
+        <w:tc>
+          <w:tcPr/>
+          <w:p>
+            <w:pPr>
+              <w:pStyle w:val="Compact"/>
+            </w:pPr>
+            <w:r>
+              <w:t xml:space="preserve">Nhanh</w:t>
+            </w:r>
+          </w:p>
+        </w:tc>
+        <w:tc>
+          <w:tcPr/>
+          <w:p>
+            <w:pPr>
+              <w:pStyle w:val="Compact"/>
+            </w:pPr>
+            <w:r>
+              <w:rPr>
+                <w:b/>
+                <w:bCs/>
+              </w:rPr>
+              <w:t xml:space="preserve">Nhanh nhất — dùng ngay</w:t>
+            </w:r>
+          </w:p>
+        </w:tc>
+      </w:tr>
+      <w:tr>
+        <w:tc>
+          <w:tcPr/>
+          <w:p>
+            <w:pPr>
+              <w:pStyle w:val="Compact"/>
+            </w:pPr>
+            <w:r>
+              <w:rPr>
+                <w:b/>
+                <w:bCs/>
+              </w:rPr>
+              <w:t xml:space="preserve">Cách tính phí</w:t>
+            </w:r>
+          </w:p>
+        </w:tc>
+        <w:tc>
+          <w:tcPr/>
+          <w:p>
+            <w:pPr>
+              <w:pStyle w:val="Compact"/>
+            </w:pPr>
+            <w:r>
+              <w:t xml:space="preserve">Theo tài nguyên (giờ CPU, GB lưu trữ, băng thông)</w:t>
+            </w:r>
+          </w:p>
+        </w:tc>
+        <w:tc>
+          <w:tcPr/>
+          <w:p>
+            <w:pPr>
+              <w:pStyle w:val="Compact"/>
+            </w:pPr>
+            <w:r>
+              <w:t xml:space="preserve">Theo tài nguyên ứng dụng / số instance</w:t>
+            </w:r>
+          </w:p>
+        </w:tc>
+        <w:tc>
+          <w:tcPr/>
+          <w:p>
+            <w:pPr>
+              <w:pStyle w:val="Compact"/>
+            </w:pPr>
+            <w:r>
+              <w:rPr>
+                <w:b/>
+                <w:bCs/>
+              </w:rPr>
+              <w:t xml:space="preserve">Theo thuê bao, số người dùng/tháng</w:t>
+            </w:r>
+          </w:p>
+        </w:tc>
+      </w:tr>
+      <w:tr>
+        <w:tc>
+          <w:tcPr/>
+          <w:p>
+            <w:pPr>
+              <w:pStyle w:val="Compact"/>
+            </w:pPr>
+            <w:r>
+              <w:rPr>
+                <w:b/>
+                <w:bCs/>
+              </w:rPr>
+              <w:t xml:space="preserve">Rủi ro vendor lock-in</w:t>
+            </w:r>
+          </w:p>
+        </w:tc>
+        <w:tc>
+          <w:tcPr/>
+          <w:p>
+            <w:pPr>
+              <w:pStyle w:val="Compact"/>
+            </w:pPr>
+            <w:r>
+              <w:t xml:space="preserve">Thấp</w:t>
+            </w:r>
+          </w:p>
+        </w:tc>
+        <w:tc>
+          <w:tcPr/>
+          <w:p>
+            <w:pPr>
+              <w:pStyle w:val="Compact"/>
+            </w:pPr>
+            <w:r>
+              <w:rPr>
+                <w:b/>
+                <w:bCs/>
+              </w:rPr>
+              <w:t xml:space="preserve">Cao</w:t>
+            </w:r>
+          </w:p>
+        </w:tc>
+        <w:tc>
+          <w:tcPr/>
+          <w:p>
+            <w:pPr>
+              <w:pStyle w:val="Compact"/>
+            </w:pPr>
+            <w:r>
+              <w:t xml:space="preserve">Trung bình – cao</w:t>
+            </w:r>
+          </w:p>
+        </w:tc>
+      </w:tr>
+      <w:tr>
+        <w:tc>
+          <w:tcPr/>
+          <w:p>
+            <w:pPr>
+              <w:pStyle w:val="Compact"/>
+            </w:pPr>
+            <w:r>
+              <w:rPr>
+                <w:b/>
+                <w:bCs/>
+              </w:rPr>
+              <w:t xml:space="preserve">Ai lo vá lỗi, nâng cấp</w:t>
+            </w:r>
+          </w:p>
+        </w:tc>
+        <w:tc>
+          <w:tcPr/>
+          <w:p>
+            <w:pPr>
+              <w:pStyle w:val="Compact"/>
+            </w:pPr>
+            <w:r>
+              <w:t xml:space="preserve">Khách hàng chịu từ OS trở lên</w:t>
+            </w:r>
+          </w:p>
+        </w:tc>
+        <w:tc>
+          <w:tcPr/>
+          <w:p>
+            <w:pPr>
+              <w:pStyle w:val="Compact"/>
+            </w:pPr>
+            <w:r>
+              <w:t xml:space="preserve">Nhà cung cấp lo tới runtime</w:t>
+            </w:r>
+          </w:p>
+        </w:tc>
+        <w:tc>
+          <w:tcPr/>
+          <w:p>
+            <w:pPr>
+              <w:pStyle w:val="Compact"/>
+            </w:pPr>
+            <w:r>
+              <w:rPr>
+                <w:b/>
+                <w:bCs/>
+              </w:rPr>
+              <w:t xml:space="preserve">Nhà cung cấp lo toàn bộ</w:t>
+            </w:r>
+          </w:p>
+        </w:tc>
+      </w:tr>
+    </w:tbl>
+    <w:p>
+      <w:pPr>
+        <w:pStyle w:val="BodyText"/>
+      </w:pPr>
+      <w:r>
+        <w:rPr>
+          <w:b/>
+          <w:bCs/>
+        </w:rPr>
+        <w:t xml:space="preserve">Mẹo nhớ:</w:t>
+      </w:r>
+      <w:r>
+        <w:t xml:space="preserve"> </w:t>
+      </w:r>
+      <w:r>
+        <w:t xml:space="preserve">IaaS =</w:t>
+      </w:r>
+      <w:r>
+        <w:t xml:space="preserve"> </w:t>
+      </w:r>
+      <w:r>
+        <w:rPr>
+          <w:i/>
+          <w:iCs/>
+        </w:rPr>
+        <w:t xml:space="preserve">thuê đất và móng, tự xây nhà</w:t>
+      </w:r>
+      <w:r>
+        <w:t xml:space="preserve"> </w:t>
+      </w:r>
+      <w:r>
+        <w:t xml:space="preserve">· PaaS =</w:t>
+      </w:r>
+      <w:r>
+        <w:t xml:space="preserve"> </w:t>
+      </w:r>
+      <w:r>
+        <w:rPr>
+          <w:i/>
+          <w:iCs/>
+        </w:rPr>
+        <w:t xml:space="preserve">thuê nhà thô có sẵn điện nước, chỉ việc bài trí</w:t>
+      </w:r>
+      <w:r>
+        <w:t xml:space="preserve"> </w:t>
+      </w:r>
+      <w:r>
+        <w:t xml:space="preserve">· SaaS =</w:t>
+      </w:r>
+      <w:r>
+        <w:t xml:space="preserve"> </w:t>
+      </w:r>
+      <w:r>
+        <w:rPr>
+          <w:i/>
+          <w:iCs/>
+        </w:rPr>
+        <w:t xml:space="preserve">thuê phòng khách sạn, vào ở ngay</w:t>
+      </w:r>
+      <w:r>
+        <w:t xml:space="preserve">.</w:t>
       </w:r>
     </w:p>
     <w:bookmarkEnd w:id="50"/>
-    <w:bookmarkStart w:id="51" w:name="các-giao-thức-tiện-ích-khác"/>
+    <w:bookmarkStart w:id="51" w:name="X91783bce2b5168893bdba1a4fc4457a999c6ce3"/>
+    <w:p>
+      <w:pPr>
+        <w:pStyle w:val="Heading4"/>
+      </w:pPr>
+      <w:r>
+        <w:t xml:space="preserve">b) Mô hình trách nhiệm phân chia —</w:t>
+      </w:r>
+      <w:r>
+        <w:t xml:space="preserve"> </w:t>
+      </w:r>
+      <w:r>
+        <w:t xml:space="preserve">“ai quản lý tầng nào”</w:t>
+      </w:r>
+    </w:p>
+    <w:tbl>
+      <w:tblPr>
+        <w:tblStyle w:val="Table"/>
+        <w:tblW w:type="auto" w:w="0"/>
+        <w:tblLook w:firstRow="1" w:lastRow="0" w:firstColumn="0" w:lastColumn="0" w:noHBand="0" w:noVBand="0" w:val="0020"/>
+      </w:tblPr>
+      <w:tblGrid>
+        <w:gridCol w:w="1584"/>
+        <w:gridCol w:w="1584"/>
+        <w:gridCol w:w="1584"/>
+        <w:gridCol w:w="1584"/>
+        <w:gridCol w:w="1584"/>
+      </w:tblGrid>
+      <w:tr>
+        <w:trPr>
+          <w:tblHeader w:val="on"/>
+        </w:trPr>
+        <w:tc>
+          <w:tcPr/>
+          <w:p>
+            <w:pPr>
+              <w:pStyle w:val="Compact"/>
+            </w:pPr>
+            <w:r>
+              <w:t xml:space="preserve">Tầng công nghệ</w:t>
+            </w:r>
+          </w:p>
+        </w:tc>
+        <w:tc>
+          <w:tcPr/>
+          <w:p>
+            <w:pPr>
+              <w:pStyle w:val="Compact"/>
+            </w:pPr>
+            <w:r>
+              <w:t xml:space="preserve">On-premise</w:t>
+            </w:r>
+          </w:p>
+        </w:tc>
+        <w:tc>
+          <w:tcPr/>
+          <w:p>
+            <w:pPr>
+              <w:pStyle w:val="Compact"/>
+            </w:pPr>
+            <w:r>
+              <w:t xml:space="preserve">IaaS</w:t>
+            </w:r>
+          </w:p>
+        </w:tc>
+        <w:tc>
+          <w:tcPr/>
+          <w:p>
+            <w:pPr>
+              <w:pStyle w:val="Compact"/>
+            </w:pPr>
+            <w:r>
+              <w:t xml:space="preserve">PaaS</w:t>
+            </w:r>
+          </w:p>
+        </w:tc>
+        <w:tc>
+          <w:tcPr/>
+          <w:p>
+            <w:pPr>
+              <w:pStyle w:val="Compact"/>
+            </w:pPr>
+            <w:r>
+              <w:t xml:space="preserve">SaaS</w:t>
+            </w:r>
+          </w:p>
+        </w:tc>
+      </w:tr>
+      <w:tr>
+        <w:tc>
+          <w:tcPr/>
+          <w:p>
+            <w:pPr>
+              <w:pStyle w:val="Compact"/>
+            </w:pPr>
+            <w:r>
+              <w:t xml:space="preserve">Applications</w:t>
+            </w:r>
+          </w:p>
+        </w:tc>
+        <w:tc>
+          <w:tcPr/>
+          <w:p>
+            <w:pPr>
+              <w:pStyle w:val="Compact"/>
+            </w:pPr>
+            <w:r>
+              <w:t xml:space="preserve">KH</w:t>
+            </w:r>
+          </w:p>
+        </w:tc>
+        <w:tc>
+          <w:tcPr/>
+          <w:p>
+            <w:pPr>
+              <w:pStyle w:val="Compact"/>
+            </w:pPr>
+            <w:r>
+              <w:t xml:space="preserve">KH</w:t>
+            </w:r>
+          </w:p>
+        </w:tc>
+        <w:tc>
+          <w:tcPr/>
+          <w:p>
+            <w:pPr>
+              <w:pStyle w:val="Compact"/>
+            </w:pPr>
+            <w:r>
+              <w:t xml:space="preserve">KH</w:t>
+            </w:r>
+          </w:p>
+        </w:tc>
+        <w:tc>
+          <w:tcPr/>
+          <w:p>
+            <w:pPr>
+              <w:pStyle w:val="Compact"/>
+            </w:pPr>
+            <w:r>
+              <w:rPr>
+                <w:b/>
+                <w:bCs/>
+              </w:rPr>
+              <w:t xml:space="preserve">NCC</w:t>
+            </w:r>
+          </w:p>
+        </w:tc>
+      </w:tr>
+      <w:tr>
+        <w:tc>
+          <w:tcPr/>
+          <w:p>
+            <w:pPr>
+              <w:pStyle w:val="Compact"/>
+            </w:pPr>
+            <w:r>
+              <w:t xml:space="preserve">Data</w:t>
+            </w:r>
+          </w:p>
+        </w:tc>
+        <w:tc>
+          <w:tcPr/>
+          <w:p>
+            <w:pPr>
+              <w:pStyle w:val="Compact"/>
+            </w:pPr>
+            <w:r>
+              <w:t xml:space="preserve">KH</w:t>
+            </w:r>
+          </w:p>
+        </w:tc>
+        <w:tc>
+          <w:tcPr/>
+          <w:p>
+            <w:pPr>
+              <w:pStyle w:val="Compact"/>
+            </w:pPr>
+            <w:r>
+              <w:t xml:space="preserve">KH</w:t>
+            </w:r>
+          </w:p>
+        </w:tc>
+        <w:tc>
+          <w:tcPr/>
+          <w:p>
+            <w:pPr>
+              <w:pStyle w:val="Compact"/>
+            </w:pPr>
+            <w:r>
+              <w:t xml:space="preserve">KH</w:t>
+            </w:r>
+          </w:p>
+        </w:tc>
+        <w:tc>
+          <w:tcPr/>
+          <w:p>
+            <w:pPr>
+              <w:pStyle w:val="Compact"/>
+            </w:pPr>
+            <w:r>
+              <w:t xml:space="preserve">KH*</w:t>
+            </w:r>
+          </w:p>
+        </w:tc>
+      </w:tr>
+      <w:tr>
+        <w:tc>
+          <w:tcPr/>
+          <w:p>
+            <w:pPr>
+              <w:pStyle w:val="Compact"/>
+            </w:pPr>
+            <w:r>
+              <w:t xml:space="preserve">Runtime</w:t>
+            </w:r>
+          </w:p>
+        </w:tc>
+        <w:tc>
+          <w:tcPr/>
+          <w:p>
+            <w:pPr>
+              <w:pStyle w:val="Compact"/>
+            </w:pPr>
+            <w:r>
+              <w:t xml:space="preserve">KH</w:t>
+            </w:r>
+          </w:p>
+        </w:tc>
+        <w:tc>
+          <w:tcPr/>
+          <w:p>
+            <w:pPr>
+              <w:pStyle w:val="Compact"/>
+            </w:pPr>
+            <w:r>
+              <w:t xml:space="preserve">KH</w:t>
+            </w:r>
+          </w:p>
+        </w:tc>
+        <w:tc>
+          <w:tcPr/>
+          <w:p>
+            <w:pPr>
+              <w:pStyle w:val="Compact"/>
+            </w:pPr>
+            <w:r>
+              <w:rPr>
+                <w:b/>
+                <w:bCs/>
+              </w:rPr>
+              <w:t xml:space="preserve">NCC</w:t>
+            </w:r>
+          </w:p>
+        </w:tc>
+        <w:tc>
+          <w:tcPr/>
+          <w:p>
+            <w:pPr>
+              <w:pStyle w:val="Compact"/>
+            </w:pPr>
+            <w:r>
+              <w:rPr>
+                <w:b/>
+                <w:bCs/>
+              </w:rPr>
+              <w:t xml:space="preserve">NCC</w:t>
+            </w:r>
+          </w:p>
+        </w:tc>
+      </w:tr>
+      <w:tr>
+        <w:tc>
+          <w:tcPr/>
+          <w:p>
+            <w:pPr>
+              <w:pStyle w:val="Compact"/>
+            </w:pPr>
+            <w:r>
+              <w:t xml:space="preserve">Middleware</w:t>
+            </w:r>
+          </w:p>
+        </w:tc>
+        <w:tc>
+          <w:tcPr/>
+          <w:p>
+            <w:pPr>
+              <w:pStyle w:val="Compact"/>
+            </w:pPr>
+            <w:r>
+              <w:t xml:space="preserve">KH</w:t>
+            </w:r>
+          </w:p>
+        </w:tc>
+        <w:tc>
+          <w:tcPr/>
+          <w:p>
+            <w:pPr>
+              <w:pStyle w:val="Compact"/>
+            </w:pPr>
+            <w:r>
+              <w:t xml:space="preserve">KH</w:t>
+            </w:r>
+          </w:p>
+        </w:tc>
+        <w:tc>
+          <w:tcPr/>
+          <w:p>
+            <w:pPr>
+              <w:pStyle w:val="Compact"/>
+            </w:pPr>
+            <w:r>
+              <w:rPr>
+                <w:b/>
+                <w:bCs/>
+              </w:rPr>
+              <w:t xml:space="preserve">NCC</w:t>
+            </w:r>
+          </w:p>
+        </w:tc>
+        <w:tc>
+          <w:tcPr/>
+          <w:p>
+            <w:pPr>
+              <w:pStyle w:val="Compact"/>
+            </w:pPr>
+            <w:r>
+              <w:rPr>
+                <w:b/>
+                <w:bCs/>
+              </w:rPr>
+              <w:t xml:space="preserve">NCC</w:t>
+            </w:r>
+          </w:p>
+        </w:tc>
+      </w:tr>
+      <w:tr>
+        <w:tc>
+          <w:tcPr/>
+          <w:p>
+            <w:pPr>
+              <w:pStyle w:val="Compact"/>
+            </w:pPr>
+            <w:r>
+              <w:t xml:space="preserve">Operating System</w:t>
+            </w:r>
+          </w:p>
+        </w:tc>
+        <w:tc>
+          <w:tcPr/>
+          <w:p>
+            <w:pPr>
+              <w:pStyle w:val="Compact"/>
+            </w:pPr>
+            <w:r>
+              <w:t xml:space="preserve">KH</w:t>
+            </w:r>
+          </w:p>
+        </w:tc>
+        <w:tc>
+          <w:tcPr/>
+          <w:p>
+            <w:pPr>
+              <w:pStyle w:val="Compact"/>
+            </w:pPr>
+            <w:r>
+              <w:t xml:space="preserve">KH</w:t>
+            </w:r>
+          </w:p>
+        </w:tc>
+        <w:tc>
+          <w:tcPr/>
+          <w:p>
+            <w:pPr>
+              <w:pStyle w:val="Compact"/>
+            </w:pPr>
+            <w:r>
+              <w:rPr>
+                <w:b/>
+                <w:bCs/>
+              </w:rPr>
+              <w:t xml:space="preserve">NCC</w:t>
+            </w:r>
+          </w:p>
+        </w:tc>
+        <w:tc>
+          <w:tcPr/>
+          <w:p>
+            <w:pPr>
+              <w:pStyle w:val="Compact"/>
+            </w:pPr>
+            <w:r>
+              <w:rPr>
+                <w:b/>
+                <w:bCs/>
+              </w:rPr>
+              <w:t xml:space="preserve">NCC</w:t>
+            </w:r>
+          </w:p>
+        </w:tc>
+      </w:tr>
+      <w:tr>
+        <w:tc>
+          <w:tcPr/>
+          <w:p>
+            <w:pPr>
+              <w:pStyle w:val="Compact"/>
+            </w:pPr>
+            <w:r>
+              <w:t xml:space="preserve">Virtualization</w:t>
+            </w:r>
+          </w:p>
+        </w:tc>
+        <w:tc>
+          <w:tcPr/>
+          <w:p>
+            <w:pPr>
+              <w:pStyle w:val="Compact"/>
+            </w:pPr>
+            <w:r>
+              <w:t xml:space="preserve">KH</w:t>
+            </w:r>
+          </w:p>
+        </w:tc>
+        <w:tc>
+          <w:tcPr/>
+          <w:p>
+            <w:pPr>
+              <w:pStyle w:val="Compact"/>
+            </w:pPr>
+            <w:r>
+              <w:rPr>
+                <w:b/>
+                <w:bCs/>
+              </w:rPr>
+              <w:t xml:space="preserve">NCC</w:t>
+            </w:r>
+          </w:p>
+        </w:tc>
+        <w:tc>
+          <w:tcPr/>
+          <w:p>
+            <w:pPr>
+              <w:pStyle w:val="Compact"/>
+            </w:pPr>
+            <w:r>
+              <w:rPr>
+                <w:b/>
+                <w:bCs/>
+              </w:rPr>
+              <w:t xml:space="preserve">NCC</w:t>
+            </w:r>
+          </w:p>
+        </w:tc>
+        <w:tc>
+          <w:tcPr/>
+          <w:p>
+            <w:pPr>
+              <w:pStyle w:val="Compact"/>
+            </w:pPr>
+            <w:r>
+              <w:rPr>
+                <w:b/>
+                <w:bCs/>
+              </w:rPr>
+              <w:t xml:space="preserve">NCC</w:t>
+            </w:r>
+          </w:p>
+        </w:tc>
+      </w:tr>
+      <w:tr>
+        <w:tc>
+          <w:tcPr/>
+          <w:p>
+            <w:pPr>
+              <w:pStyle w:val="Compact"/>
+            </w:pPr>
+            <w:r>
+              <w:t xml:space="preserve">Servers</w:t>
+            </w:r>
+          </w:p>
+        </w:tc>
+        <w:tc>
+          <w:tcPr/>
+          <w:p>
+            <w:pPr>
+              <w:pStyle w:val="Compact"/>
+            </w:pPr>
+            <w:r>
+              <w:t xml:space="preserve">KH</w:t>
+            </w:r>
+          </w:p>
+        </w:tc>
+        <w:tc>
+          <w:tcPr/>
+          <w:p>
+            <w:pPr>
+              <w:pStyle w:val="Compact"/>
+            </w:pPr>
+            <w:r>
+              <w:rPr>
+                <w:b/>
+                <w:bCs/>
+              </w:rPr>
+              <w:t xml:space="preserve">NCC</w:t>
+            </w:r>
+          </w:p>
+        </w:tc>
+        <w:tc>
+          <w:tcPr/>
+          <w:p>
+            <w:pPr>
+              <w:pStyle w:val="Compact"/>
+            </w:pPr>
+            <w:r>
+              <w:rPr>
+                <w:b/>
+                <w:bCs/>
+              </w:rPr>
+              <w:t xml:space="preserve">NCC</w:t>
+            </w:r>
+          </w:p>
+        </w:tc>
+        <w:tc>
+          <w:tcPr/>
+          <w:p>
+            <w:pPr>
+              <w:pStyle w:val="Compact"/>
+            </w:pPr>
+            <w:r>
+              <w:rPr>
+                <w:b/>
+                <w:bCs/>
+              </w:rPr>
+              <w:t xml:space="preserve">NCC</w:t>
+            </w:r>
+          </w:p>
+        </w:tc>
+      </w:tr>
+      <w:tr>
+        <w:tc>
+          <w:tcPr/>
+          <w:p>
+            <w:pPr>
+              <w:pStyle w:val="Compact"/>
+            </w:pPr>
+            <w:r>
+              <w:t xml:space="preserve">Storage</w:t>
+            </w:r>
+          </w:p>
+        </w:tc>
+        <w:tc>
+          <w:tcPr/>
+          <w:p>
+            <w:pPr>
+              <w:pStyle w:val="Compact"/>
+            </w:pPr>
+            <w:r>
+              <w:t xml:space="preserve">KH</w:t>
+            </w:r>
+          </w:p>
+        </w:tc>
+        <w:tc>
+          <w:tcPr/>
+          <w:p>
+            <w:pPr>
+              <w:pStyle w:val="Compact"/>
+            </w:pPr>
+            <w:r>
+              <w:rPr>
+                <w:b/>
+                <w:bCs/>
+              </w:rPr>
+              <w:t xml:space="preserve">NCC</w:t>
+            </w:r>
+          </w:p>
+        </w:tc>
+        <w:tc>
+          <w:tcPr/>
+          <w:p>
+            <w:pPr>
+              <w:pStyle w:val="Compact"/>
+            </w:pPr>
+            <w:r>
+              <w:rPr>
+                <w:b/>
+                <w:bCs/>
+              </w:rPr>
+              <w:t xml:space="preserve">NCC</w:t>
+            </w:r>
+          </w:p>
+        </w:tc>
+        <w:tc>
+          <w:tcPr/>
+          <w:p>
+            <w:pPr>
+              <w:pStyle w:val="Compact"/>
+            </w:pPr>
+            <w:r>
+              <w:rPr>
+                <w:b/>
+                <w:bCs/>
+              </w:rPr>
+              <w:t xml:space="preserve">NCC</w:t>
+            </w:r>
+          </w:p>
+        </w:tc>
+      </w:tr>
+      <w:tr>
+        <w:tc>
+          <w:tcPr/>
+          <w:p>
+            <w:pPr>
+              <w:pStyle w:val="Compact"/>
+            </w:pPr>
+            <w:r>
+              <w:t xml:space="preserve">Networking</w:t>
+            </w:r>
+          </w:p>
+        </w:tc>
+        <w:tc>
+          <w:tcPr/>
+          <w:p>
+            <w:pPr>
+              <w:pStyle w:val="Compact"/>
+            </w:pPr>
+            <w:r>
+              <w:t xml:space="preserve">KH</w:t>
+            </w:r>
+          </w:p>
+        </w:tc>
+        <w:tc>
+          <w:tcPr/>
+          <w:p>
+            <w:pPr>
+              <w:pStyle w:val="Compact"/>
+            </w:pPr>
+            <w:r>
+              <w:rPr>
+                <w:b/>
+                <w:bCs/>
+              </w:rPr>
+              <w:t xml:space="preserve">NCC</w:t>
+            </w:r>
+          </w:p>
+        </w:tc>
+        <w:tc>
+          <w:tcPr/>
+          <w:p>
+            <w:pPr>
+              <w:pStyle w:val="Compact"/>
+            </w:pPr>
+            <w:r>
+              <w:rPr>
+                <w:b/>
+                <w:bCs/>
+              </w:rPr>
+              <w:t xml:space="preserve">NCC</w:t>
+            </w:r>
+          </w:p>
+        </w:tc>
+        <w:tc>
+          <w:tcPr/>
+          <w:p>
+            <w:pPr>
+              <w:pStyle w:val="Compact"/>
+            </w:pPr>
+            <w:r>
+              <w:rPr>
+                <w:b/>
+                <w:bCs/>
+              </w:rPr>
+              <w:t xml:space="preserve">NCC</w:t>
+            </w:r>
+          </w:p>
+        </w:tc>
+      </w:tr>
+    </w:tbl>
+    <w:p>
+      <w:pPr>
+        <w:pStyle w:val="BodyText"/>
+      </w:pPr>
+      <w:r>
+        <w:rPr>
+          <w:i/>
+          <w:iCs/>
+        </w:rPr>
+        <w:t xml:space="preserve">(KH = khách hàng tự quản lý · NCC = nhà cung cấp lo. Dữ liệu ở SaaS vẫn thuộc sở hữu khách hàng nhưng do NCC lưu trữ.)</w:t>
+      </w:r>
+    </w:p>
+    <w:bookmarkEnd w:id="51"/>
+    <w:bookmarkStart w:id="52" w:name="c-ví-dụ-minh-họa-thực-tế"/>
+    <w:p>
+      <w:pPr>
+        <w:pStyle w:val="Heading4"/>
+      </w:pPr>
+      <w:r>
+        <w:t xml:space="preserve">c) Ví dụ minh họa thực tế ⭐⭐</w:t>
+      </w:r>
+    </w:p>
+    <w:tbl>
+      <w:tblPr>
+        <w:tblStyle w:val="Table"/>
+        <w:tblW w:type="pct" w:w="5000"/>
+        <w:tblLayout w:type="fixed"/>
+        <w:tblLook w:firstRow="1" w:lastRow="0" w:firstColumn="0" w:lastColumn="0" w:noHBand="0" w:noVBand="0" w:val="0020"/>
+      </w:tblPr>
+      <w:tblGrid>
+        <w:gridCol w:w="1980"/>
+        <w:gridCol w:w="1980"/>
+        <w:gridCol w:w="1980"/>
+        <w:gridCol w:w="1980"/>
+      </w:tblGrid>
+      <w:tr>
+        <w:trPr>
+          <w:tblHeader w:val="on"/>
+        </w:trPr>
+        <w:tc>
+          <w:tcPr/>
+          <w:p>
+            <w:pPr>
+              <w:pStyle w:val="Compact"/>
+            </w:pPr>
+            <w:r>
+              <w:t xml:space="preserve">Loại hình</w:t>
+            </w:r>
+          </w:p>
+        </w:tc>
+        <w:tc>
+          <w:tcPr/>
+          <w:p>
+            <w:pPr>
+              <w:pStyle w:val="Compact"/>
+            </w:pPr>
+            <w:r>
+              <w:t xml:space="preserve">Ví dụ quốc tế</w:t>
+            </w:r>
+          </w:p>
+        </w:tc>
+        <w:tc>
+          <w:tcPr/>
+          <w:p>
+            <w:pPr>
+              <w:pStyle w:val="Compact"/>
+            </w:pPr>
+            <w:r>
+              <w:t xml:space="preserve">Ví dụ Việt Nam</w:t>
+            </w:r>
+          </w:p>
+        </w:tc>
+        <w:tc>
+          <w:tcPr/>
+          <w:p>
+            <w:pPr>
+              <w:pStyle w:val="Compact"/>
+            </w:pPr>
+            <w:r>
+              <w:t xml:space="preserve">Tình huống sử dụng</w:t>
+            </w:r>
+          </w:p>
+        </w:tc>
+      </w:tr>
+      <w:tr>
+        <w:tc>
+          <w:tcPr/>
+          <w:p>
+            <w:pPr>
+              <w:pStyle w:val="Compact"/>
+            </w:pPr>
+            <w:r>
+              <w:rPr>
+                <w:b/>
+                <w:bCs/>
+              </w:rPr>
+              <w:t xml:space="preserve">IaaS</w:t>
+            </w:r>
+          </w:p>
+        </w:tc>
+        <w:tc>
+          <w:tcPr/>
+          <w:p>
+            <w:pPr>
+              <w:pStyle w:val="Compact"/>
+            </w:pPr>
+            <w:r>
+              <w:rPr>
+                <w:b/>
+                <w:bCs/>
+              </w:rPr>
+              <w:t xml:space="preserve">Amazon EC2, Google Compute Engine, Azure Virtual Machines</w:t>
+            </w:r>
+          </w:p>
+        </w:tc>
+        <w:tc>
+          <w:tcPr/>
+          <w:p>
+            <w:pPr>
+              <w:pStyle w:val="Compact"/>
+            </w:pPr>
+            <w:r>
+              <w:rPr>
+                <w:b/>
+                <w:bCs/>
+              </w:rPr>
+              <w:t xml:space="preserve">Viettel Cloud, VNPT Cloud, FPT Cloud, CMC Cloud</w:t>
+            </w:r>
+          </w:p>
+        </w:tc>
+        <w:tc>
+          <w:tcPr/>
+          <w:p>
+            <w:pPr>
+              <w:pStyle w:val="Compact"/>
+            </w:pPr>
+            <w:r>
+              <w:t xml:space="preserve">Sàn TMĐT thuê 20 máy chủ ảo dịp Tết để chịu tải, hết cao điểm trả lại — không phải mua máy chủ vật lý</w:t>
+            </w:r>
+          </w:p>
+        </w:tc>
+      </w:tr>
+      <w:tr>
+        <w:tc>
+          <w:tcPr/>
+          <w:p>
+            <w:pPr>
+              <w:pStyle w:val="Compact"/>
+            </w:pPr>
+            <w:r>
+              <w:rPr>
+                <w:b/>
+                <w:bCs/>
+              </w:rPr>
+              <w:t xml:space="preserve">PaaS</w:t>
+            </w:r>
+          </w:p>
+        </w:tc>
+        <w:tc>
+          <w:tcPr/>
+          <w:p>
+            <w:pPr>
+              <w:pStyle w:val="Compact"/>
+            </w:pPr>
+            <w:r>
+              <w:rPr>
+                <w:b/>
+                <w:bCs/>
+              </w:rPr>
+              <w:t xml:space="preserve">Google App Engine, Heroku, AWS Elastic Beanstalk, Azure App Service</w:t>
+            </w:r>
+          </w:p>
+        </w:tc>
+        <w:tc>
+          <w:tcPr/>
+          <w:p>
+            <w:pPr>
+              <w:pStyle w:val="Compact"/>
+            </w:pPr>
+            <w:r>
+              <w:t xml:space="preserve">Nền tảng low-code trong nước (Base.vn, akaBot — một phần)</w:t>
+            </w:r>
+          </w:p>
+        </w:tc>
+        <w:tc>
+          <w:tcPr/>
+          <w:p>
+            <w:pPr>
+              <w:pStyle w:val="Compact"/>
+            </w:pPr>
+            <w:r>
+              <w:t xml:space="preserve">Nhóm 3 lập trình viên của startup đẩy code Node.js lên Heroku là chạy được, không cần cài đặt và vá lỗi hệ điều hành</w:t>
+            </w:r>
+          </w:p>
+        </w:tc>
+      </w:tr>
+      <w:tr>
+        <w:tc>
+          <w:tcPr/>
+          <w:p>
+            <w:pPr>
+              <w:pStyle w:val="Compact"/>
+            </w:pPr>
+            <w:r>
+              <w:rPr>
+                <w:b/>
+                <w:bCs/>
+              </w:rPr>
+              <w:t xml:space="preserve">SaaS</w:t>
+            </w:r>
+          </w:p>
+        </w:tc>
+        <w:tc>
+          <w:tcPr/>
+          <w:p>
+            <w:pPr>
+              <w:pStyle w:val="Compact"/>
+            </w:pPr>
+            <w:r>
+              <w:rPr>
+                <w:b/>
+                <w:bCs/>
+              </w:rPr>
+              <w:t xml:space="preserve">Gmail/Google Workspace, Microsoft 365, Salesforce, Shopify, Zoom</w:t>
+            </w:r>
+          </w:p>
+        </w:tc>
+        <w:tc>
+          <w:tcPr/>
+          <w:p>
+            <w:pPr>
+              <w:pStyle w:val="Compact"/>
+            </w:pPr>
+            <w:r>
+              <w:rPr>
+                <w:b/>
+                <w:bCs/>
+              </w:rPr>
+              <w:t xml:space="preserve">MISA AMIS, KiotViet, Base.vn, Haravan</w:t>
+            </w:r>
+          </w:p>
+        </w:tc>
+        <w:tc>
+          <w:tcPr/>
+          <w:p>
+            <w:pPr>
+              <w:pStyle w:val="Compact"/>
+            </w:pPr>
+            <w:r>
+              <w:t xml:space="preserve">Cửa hàng FMCG trả 300.000đ/tháng dùng KiotViet quản lý bán hàng — không cần lập trình viên, không cần máy chủ</w:t>
+            </w:r>
+          </w:p>
+        </w:tc>
+      </w:tr>
+    </w:tbl>
+    <w:bookmarkEnd w:id="52"/>
+    <w:bookmarkStart w:id="53" w:name="d-liên-hệ-với-e-business"/>
+    <w:p>
+      <w:pPr>
+        <w:pStyle w:val="Heading4"/>
+      </w:pPr>
+      <w:r>
+        <w:t xml:space="preserve">d) Liên hệ với E-business</w:t>
+      </w:r>
+    </w:p>
+    <w:p>
+      <w:pPr>
+        <w:pStyle w:val="FirstParagraph"/>
+      </w:pPr>
+      <w:r>
+        <w:rPr>
+          <w:b/>
+          <w:bCs/>
+        </w:rPr>
+        <w:t xml:space="preserve">ERP cung cấp online chính là SaaS</w:t>
+      </w:r>
+      <w:r>
+        <w:t xml:space="preserve">: thay vì cài đặt và tùy biến ERP trên mạng nội bộ, doanh nghiệp</w:t>
+      </w:r>
+      <w:r>
+        <w:t xml:space="preserve"> </w:t>
+      </w:r>
+      <w:r>
+        <w:rPr>
+          <w:b/>
+          <w:bCs/>
+        </w:rPr>
+        <w:t xml:space="preserve">dùng trình duyệt truy cập ERP trên site của nhà cung cấp</w:t>
+      </w:r>
+      <w:r>
+        <w:t xml:space="preserve"> </w:t>
+      </w:r>
+      <w:r>
+        <w:t xml:space="preserve">(ví dụ</w:t>
+      </w:r>
+      <w:r>
+        <w:t xml:space="preserve"> </w:t>
+      </w:r>
+      <w:r>
+        <w:rPr>
+          <w:b/>
+          <w:bCs/>
+        </w:rPr>
+        <w:t xml:space="preserve">NetSuite</w:t>
+      </w:r>
+      <w:r>
+        <w:t xml:space="preserve">) — xem Chương 3 §2.12c. Đây là lý do cloud đặc biệt quan trọng với</w:t>
+      </w:r>
+      <w:r>
+        <w:t xml:space="preserve"> </w:t>
+      </w:r>
+      <w:r>
+        <w:rPr>
+          <w:b/>
+          <w:bCs/>
+        </w:rPr>
+        <w:t xml:space="preserve">doanh nghiệp vừa và nhỏ</w:t>
+      </w:r>
+      <w:r>
+        <w:t xml:space="preserve"> </w:t>
+      </w:r>
+      <w:r>
+        <w:t xml:space="preserve">và</w:t>
+      </w:r>
+      <w:r>
+        <w:t xml:space="preserve"> </w:t>
+      </w:r>
+      <w:r>
+        <w:rPr>
+          <w:b/>
+          <w:bCs/>
+        </w:rPr>
+        <w:t xml:space="preserve">startup</w:t>
+      </w:r>
+      <w:r>
+        <w:t xml:space="preserve">: cho phép khởi động nhanh với chi phí đầu tư ban đầu gần bằng 0.</w:t>
+      </w:r>
+    </w:p>
+    <w:bookmarkEnd w:id="53"/>
+    <w:bookmarkEnd w:id="54"/>
+    <w:bookmarkStart w:id="55" w:name="các-giao-thức-tiện-ích-khác"/>
     <w:p>
       <w:pPr>
         <w:pStyle w:val="Heading3"/>
@@ -4715,8 +6517,8 @@
         <w:t xml:space="preserve">Ping, Tracert…</w:t>
       </w:r>
     </w:p>
-    <w:bookmarkEnd w:id="51"/>
-    <w:bookmarkStart w:id="52" w:name="kiến-trúc-hạ-tầng-internet"/>
+    <w:bookmarkEnd w:id="55"/>
+    <w:bookmarkStart w:id="56" w:name="kiến-trúc-hạ-tầng-internet"/>
     <w:p>
       <w:pPr>
         <w:pStyle w:val="Heading3"/>
@@ -4975,8 +6777,8 @@
         <w:t xml:space="preserve">.</w:t>
       </w:r>
     </w:p>
-    <w:bookmarkEnd w:id="52"/>
-    <w:bookmarkStart w:id="53" w:name="ai-quản-trị-internet"/>
+    <w:bookmarkEnd w:id="56"/>
+    <w:bookmarkStart w:id="57" w:name="ai-quản-trị-internet"/>
     <w:p>
       <w:pPr>
         <w:pStyle w:val="Heading3"/>
@@ -4997,8 +6799,8 @@
         <w:t xml:space="preserve">ICANN, IETF, IRTF, IESG, IAB, ISOC, IGF, W3C, NOGs.</w:t>
       </w:r>
     </w:p>
-    <w:bookmarkEnd w:id="53"/>
-    <w:bookmarkStart w:id="54" w:name="web-htmlxml-web-server-browser"/>
+    <w:bookmarkEnd w:id="57"/>
+    <w:bookmarkStart w:id="58" w:name="web-htmlxml-web-server-browser"/>
     <w:p>
       <w:pPr>
         <w:pStyle w:val="Heading3"/>
@@ -5429,8 +7231,8 @@
         <w:t xml:space="preserve">bất kỳ thiết bị nào nối Internet có thể gửi yêu cầu HTTP và hiển thị trang HTML.</w:t>
       </w:r>
     </w:p>
-    <w:bookmarkEnd w:id="54"/>
-    <w:bookmarkStart w:id="55" w:name="X11a59f369b3cc9dc903d922d77e00f1ba8430ee"/>
+    <w:bookmarkEnd w:id="58"/>
+    <w:bookmarkStart w:id="59" w:name="X11a59f369b3cc9dc903d922d77e00f1ba8430ee"/>
     <w:p>
       <w:pPr>
         <w:pStyle w:val="Heading3"/>
@@ -5913,9 +7715,9 @@
         </w:pict>
       </w:r>
     </w:p>
-    <w:bookmarkEnd w:id="55"/>
-    <w:bookmarkEnd w:id="56"/>
-    <w:bookmarkStart w:id="57" w:name="checklist-ôn-chương-1"/>
+    <w:bookmarkEnd w:id="59"/>
+    <w:bookmarkEnd w:id="60"/>
+    <w:bookmarkStart w:id="61" w:name="checklist-ôn-chương-1"/>
     <w:p>
       <w:pPr>
         <w:pStyle w:val="Heading2"/>
@@ -6082,8 +7884,8 @@
         <w:t xml:space="preserve">Crawling – Indexing – Ranking</w:t>
       </w:r>
     </w:p>
-    <w:bookmarkEnd w:id="57"/>
-    <w:bookmarkEnd w:id="58"/>
+    <w:bookmarkEnd w:id="61"/>
+    <w:bookmarkEnd w:id="62"/>
     <w:sectPr>
       <w:footnotePr>
         <w:numRestart w:val="eachSect"/>

</xml_diff>